<commit_message>
SRS - Website Music With ChatboxAI
--Done
</commit_message>
<xml_diff>
--- a/SPECIFICATION DOCUMENT FOR AI WEB MUSIC.docx
+++ b/SPECIFICATION DOCUMENT FOR AI WEB MUSIC.docx
@@ -558,19 +558,6 @@
     </w:p>
     <w:p>
       <w:pPr>
-        <w:pStyle w:val="NormalWeb"/>
-        <w:numPr>
-          <w:ilvl w:val="0"/>
-          <w:numId w:val="2"/>
-        </w:numPr>
-      </w:pPr>
-      <w:r>
-        <w:lastRenderedPageBreak/>
-        <w:t xml:space="preserve">UI Tool </w:t>
-      </w:r>
-    </w:p>
-    <w:p>
-      <w:pPr>
         <w:pStyle w:val="Heading2"/>
         <w:rPr>
           <w:rFonts w:ascii="Times New Roman" w:hAnsi="Times New Roman" w:cs="Times New Roman"/>
@@ -585,6 +572,7 @@
           <w:sz w:val="24"/>
           <w:szCs w:val="24"/>
         </w:rPr>
+        <w:lastRenderedPageBreak/>
         <w:t>1.5 Document overview</w:t>
       </w:r>
     </w:p>
@@ -882,7 +870,6 @@
           <w:sz w:val="24"/>
           <w:szCs w:val="24"/>
         </w:rPr>
-        <w:lastRenderedPageBreak/>
         <w:t>2.3 User Characteristics</w:t>
       </w:r>
     </w:p>
@@ -903,7 +890,11 @@
         <w:t>Primary Users:</w:t>
       </w:r>
       <w:r>
-        <w:t> Music enthusiasts who want personalized music recommendations. These users are typically tech-savvy individuals who value discovering new music tailored to their tastes and listening habits. They may include casual listeners, audiophiles, or even professional musicians seeking inspiration.</w:t>
+        <w:t xml:space="preserve"> Music enthusiasts who want personalized music recommendations. These users are typically tech-savvy individuals who value discovering new music tailored to </w:t>
+      </w:r>
+      <w:r>
+        <w:lastRenderedPageBreak/>
+        <w:t>their tastes and listening habits. They may include casual listeners, audiophiles, or even professional musicians seeking inspiration.</w:t>
       </w:r>
     </w:p>
     <w:p>
@@ -1146,7 +1137,6 @@
         <w:rPr>
           <w:lang w:val="en-GB"/>
         </w:rPr>
-        <w:lastRenderedPageBreak/>
         <w:t>When they finish entering information, they must click the “Login” button so the system can check their account.</w:t>
       </w:r>
     </w:p>
@@ -1204,6 +1194,7 @@
         <w:rPr>
           <w:lang w:val="en-GB"/>
         </w:rPr>
+        <w:lastRenderedPageBreak/>
         <w:t>If they don’t have account to login this application, they can create a new account by click “</w:t>
       </w:r>
       <w:r>
@@ -2986,13 +2977,8 @@
         <w:jc w:val="both"/>
       </w:pPr>
       <w:r>
-        <w:t xml:space="preserve">Explanation of the Data Flow Diagram (DFD) for Your Music Website with AI </w:t>
-      </w:r>
-      <w:proofErr w:type="spellStart"/>
-      <w:r>
-        <w:t>Chatbox</w:t>
-      </w:r>
-      <w:proofErr w:type="spellEnd"/>
+        <w:t>Explanation of the Data Flow Diagram (DFD) for Your Music Website with AI Chatbox</w:t>
+      </w:r>
     </w:p>
     <w:p>
       <w:pPr>
@@ -3003,15 +2989,7 @@
         </w:rPr>
       </w:pPr>
       <w:r>
-        <w:t xml:space="preserve">This Level 1 DFD provides a high-level overview of how data flows through your music streaming website with an AI-powered </w:t>
-      </w:r>
-      <w:proofErr w:type="spellStart"/>
-      <w:r>
-        <w:t>chatbox</w:t>
-      </w:r>
-      <w:proofErr w:type="spellEnd"/>
-      <w:r>
-        <w:t>. The system consists of multiple components, each handling specific tasks.</w:t>
+        <w:t>This Level 1 DFD provides a high-level overview of how data flows through your music streaming website with an AI-powered chatbox. The system consists of multiple components, each handling specific tasks.</w:t>
       </w:r>
     </w:p>
     <w:p>
@@ -3071,15 +3049,7 @@
         <w:jc w:val="both"/>
       </w:pPr>
       <w:r>
-        <w:t xml:space="preserve">They search for music, play songs, and chat with the AI </w:t>
-      </w:r>
-      <w:proofErr w:type="spellStart"/>
-      <w:r>
-        <w:t>chatbox</w:t>
-      </w:r>
-      <w:proofErr w:type="spellEnd"/>
-      <w:r>
-        <w:t>.</w:t>
+        <w:t>They search for music, play songs, and chat with the AI chatbox.</w:t>
       </w:r>
     </w:p>
     <w:p>
@@ -3218,17 +3188,8 @@
           <w:b/>
           <w:bCs/>
         </w:rPr>
-        <w:t xml:space="preserve">4. AI </w:t>
-      </w:r>
-      <w:proofErr w:type="spellStart"/>
-      <w:r>
-        <w:rPr>
-          <w:b/>
-          <w:bCs/>
-        </w:rPr>
-        <w:t>Chatbox</w:t>
-      </w:r>
-      <w:proofErr w:type="spellEnd"/>
+        <w:t>4. AI Chatbox</w:t>
+      </w:r>
     </w:p>
     <w:p>
       <w:pPr>
@@ -3284,15 +3245,7 @@
         <w:jc w:val="both"/>
       </w:pPr>
       <w:r>
-        <w:t xml:space="preserve">Inside the AI </w:t>
-      </w:r>
-      <w:proofErr w:type="spellStart"/>
-      <w:r>
-        <w:t>chatbox</w:t>
-      </w:r>
-      <w:proofErr w:type="spellEnd"/>
-      <w:r>
-        <w:t>:</w:t>
+        <w:t>Inside the AI chatbox:</w:t>
       </w:r>
     </w:p>
     <w:p>
@@ -3557,15 +3510,7 @@
         </w:rPr>
       </w:pPr>
       <w:r>
-        <w:t xml:space="preserve">This Use Case Diagram represents a Website Music System with </w:t>
-      </w:r>
-      <w:proofErr w:type="spellStart"/>
-      <w:r>
-        <w:t>Chatbox</w:t>
-      </w:r>
-      <w:proofErr w:type="spellEnd"/>
-      <w:r>
-        <w:t xml:space="preserve"> AI. It includes various functionalities related to music browsing, playlist management, AI-based recommendations, user management, and authentication. Below is a breakdown of the key elements:</w:t>
+        <w:t>This Use Case Diagram represents a Website Music System with Chatbox AI. It includes various functionalities related to music browsing, playlist management, AI-based recommendations, user management, and authentication. Below is a breakdown of the key elements:</w:t>
       </w:r>
     </w:p>
     <w:p>
@@ -3707,13 +3652,8 @@
         </w:numPr>
         <w:jc w:val="both"/>
       </w:pPr>
-      <w:proofErr w:type="spellStart"/>
-      <w:r>
-        <w:t>Chatbox</w:t>
-      </w:r>
-      <w:proofErr w:type="spellEnd"/>
-      <w:r>
-        <w:t xml:space="preserve"> AI interacts with music browsing.</w:t>
+      <w:r>
+        <w:t>Chatbox AI interacts with music browsing.</w:t>
       </w:r>
     </w:p>
     <w:p>
@@ -4161,15 +4101,7 @@
         </w:rPr>
       </w:pPr>
       <w:r>
-        <w:t xml:space="preserve">This diagram illustrates how users interact with the music system to browse, play, and manage playlists, while admins handle user and song management. The </w:t>
-      </w:r>
-      <w:proofErr w:type="spellStart"/>
-      <w:r>
-        <w:t>Chatbox</w:t>
-      </w:r>
-      <w:proofErr w:type="spellEnd"/>
-      <w:r>
-        <w:t xml:space="preserve"> AI is integrated for music recommendations and interactions, and authentication allows users to log in via various methods.</w:t>
+        <w:t>This diagram illustrates how users interact with the music system to browse, play, and manage playlists, while admins handle user and song management. The Chatbox AI is integrated for music recommendations and interactions, and authentication allows users to log in via various methods.</w:t>
       </w:r>
     </w:p>
     <w:p>
@@ -4537,17 +4469,8 @@
           <w:b/>
           <w:bCs/>
         </w:rPr>
-        <w:t xml:space="preserve">If credentials are valid → </w:t>
-      </w:r>
-      <w:proofErr w:type="spellStart"/>
-      <w:r>
-        <w:rPr>
-          <w:b/>
-          <w:bCs/>
-        </w:rPr>
-        <w:t>LoginSuccess</w:t>
-      </w:r>
-      <w:proofErr w:type="spellEnd"/>
+        <w:t>If credentials are valid → LoginSuccess</w:t>
+      </w:r>
       <w:r>
         <w:t>: The user is logged in.</w:t>
       </w:r>
@@ -4566,17 +4489,8 @@
           <w:b/>
           <w:bCs/>
         </w:rPr>
-        <w:t xml:space="preserve">If credentials are invalid → </w:t>
-      </w:r>
-      <w:proofErr w:type="spellStart"/>
-      <w:r>
-        <w:rPr>
-          <w:b/>
-          <w:bCs/>
-        </w:rPr>
-        <w:t>LoginFailure</w:t>
-      </w:r>
-      <w:proofErr w:type="spellEnd"/>
+        <w:t>If credentials are invalid → LoginFailure</w:t>
+      </w:r>
       <w:r>
         <w:t xml:space="preserve">: The system displays an </w:t>
       </w:r>
@@ -4675,17 +4589,8 @@
           <w:b/>
           <w:bCs/>
         </w:rPr>
-        <w:t xml:space="preserve">If authentication is successful → </w:t>
-      </w:r>
-      <w:proofErr w:type="spellStart"/>
-      <w:r>
-        <w:rPr>
-          <w:b/>
-          <w:bCs/>
-        </w:rPr>
-        <w:t>LoginSuccess</w:t>
-      </w:r>
-      <w:proofErr w:type="spellEnd"/>
+        <w:t>If authentication is successful → LoginSuccess</w:t>
+      </w:r>
       <w:r>
         <w:t>: The user is logged in.</w:t>
       </w:r>
@@ -4704,17 +4609,8 @@
           <w:b/>
           <w:bCs/>
         </w:rPr>
-        <w:t xml:space="preserve">If authentication fails → </w:t>
-      </w:r>
-      <w:proofErr w:type="spellStart"/>
-      <w:r>
-        <w:rPr>
-          <w:b/>
-          <w:bCs/>
-        </w:rPr>
-        <w:t>LoginFailure</w:t>
-      </w:r>
-      <w:proofErr w:type="spellEnd"/>
+        <w:t>If authentication fails → LoginFailure</w:t>
+      </w:r>
       <w:r>
         <w:t xml:space="preserve">: The system displays an </w:t>
       </w:r>
@@ -5492,15 +5388,7 @@
         <w:t>User Opens Playlist Management:</w:t>
       </w:r>
       <w:r>
-        <w:t xml:space="preserve"> The user accesses the playlist management interface (</w:t>
-      </w:r>
-      <w:proofErr w:type="spellStart"/>
-      <w:r>
-        <w:t>OpenPlaylistPage</w:t>
-      </w:r>
-      <w:proofErr w:type="spellEnd"/>
-      <w:r>
-        <w:t>).</w:t>
+        <w:t xml:space="preserve"> The user accesses the playlist management interface (OpenPlaylistPage).</w:t>
       </w:r>
     </w:p>
     <w:p>
@@ -5533,23 +5421,7 @@
         <w:jc w:val="both"/>
       </w:pPr>
       <w:r>
-        <w:t>Create a new playlist (</w:t>
-      </w:r>
-      <w:proofErr w:type="spellStart"/>
-      <w:r>
-        <w:t>CreatePlaylist</w:t>
-      </w:r>
-      <w:proofErr w:type="spellEnd"/>
-      <w:r>
-        <w:t>) → The playlist is displayed (</w:t>
-      </w:r>
-      <w:proofErr w:type="spellStart"/>
-      <w:r>
-        <w:t>DisplayPlaylist</w:t>
-      </w:r>
-      <w:proofErr w:type="spellEnd"/>
-      <w:r>
-        <w:t>).</w:t>
+        <w:t>Create a new playlist (CreatePlaylist) → The playlist is displayed (DisplayPlaylist).</w:t>
       </w:r>
     </w:p>
     <w:p>
@@ -5562,15 +5434,7 @@
         <w:jc w:val="both"/>
       </w:pPr>
       <w:r>
-        <w:t>Select an existing playlist (</w:t>
-      </w:r>
-      <w:proofErr w:type="spellStart"/>
-      <w:r>
-        <w:t>SelectPlaylist</w:t>
-      </w:r>
-      <w:proofErr w:type="spellEnd"/>
-      <w:r>
-        <w:t>), then:</w:t>
+        <w:t>Select an existing playlist (SelectPlaylist), then:</w:t>
       </w:r>
     </w:p>
     <w:p>
@@ -5590,15 +5454,7 @@
         <w:t>Add songs</w:t>
       </w:r>
       <w:r>
-        <w:t xml:space="preserve"> (</w:t>
-      </w:r>
-      <w:proofErr w:type="spellStart"/>
-      <w:r>
-        <w:t>AddSongs</w:t>
-      </w:r>
-      <w:proofErr w:type="spellEnd"/>
-      <w:r>
-        <w:t>) → Updates and displays the playlist.</w:t>
+        <w:t xml:space="preserve"> (AddSongs) → Updates and displays the playlist.</w:t>
       </w:r>
     </w:p>
     <w:p>
@@ -5618,15 +5474,7 @@
         <w:t>Remove songs</w:t>
       </w:r>
       <w:r>
-        <w:t xml:space="preserve"> (</w:t>
-      </w:r>
-      <w:proofErr w:type="spellStart"/>
-      <w:r>
-        <w:t>RemoveSongs</w:t>
-      </w:r>
-      <w:proofErr w:type="spellEnd"/>
-      <w:r>
-        <w:t>) → Updates and displays the playlist.</w:t>
+        <w:t xml:space="preserve"> (RemoveSongs) → Updates and displays the playlist.</w:t>
       </w:r>
     </w:p>
     <w:p>
@@ -5646,15 +5494,7 @@
         <w:t>Rename the playlist</w:t>
       </w:r>
       <w:r>
-        <w:t xml:space="preserve"> (</w:t>
-      </w:r>
-      <w:proofErr w:type="spellStart"/>
-      <w:r>
-        <w:t>RenamePlaylist</w:t>
-      </w:r>
-      <w:proofErr w:type="spellEnd"/>
-      <w:r>
-        <w:t>) → Updates and displays the playlist.</w:t>
+        <w:t xml:space="preserve"> (RenamePlaylist) → Updates and displays the playlist.</w:t>
       </w:r>
     </w:p>
     <w:p>
@@ -5674,15 +5514,7 @@
         <w:t>Delete the playlist</w:t>
       </w:r>
       <w:r>
-        <w:t xml:space="preserve"> (</w:t>
-      </w:r>
-      <w:proofErr w:type="spellStart"/>
-      <w:r>
-        <w:t>DeletePlaylist</w:t>
-      </w:r>
-      <w:proofErr w:type="spellEnd"/>
-      <w:r>
-        <w:t>), leading to:</w:t>
+        <w:t xml:space="preserve"> (DeletePlaylist), leading to:</w:t>
       </w:r>
     </w:p>
     <w:p>
@@ -5695,15 +5527,7 @@
         <w:jc w:val="both"/>
       </w:pPr>
       <w:r>
-        <w:t>Confirmation step (</w:t>
-      </w:r>
-      <w:proofErr w:type="spellStart"/>
-      <w:r>
-        <w:t>ConfirmDeletion</w:t>
-      </w:r>
-      <w:proofErr w:type="spellEnd"/>
-      <w:r>
-        <w:t>):</w:t>
+        <w:t>Confirmation step (ConfirmDeletion):</w:t>
       </w:r>
     </w:p>
     <w:p>
@@ -5729,15 +5553,7 @@
         <w:jc w:val="both"/>
       </w:pPr>
       <w:r>
-        <w:t>If the user confirms (</w:t>
-      </w:r>
-      <w:proofErr w:type="spellStart"/>
-      <w:r>
-        <w:t>DeleteSuccess</w:t>
-      </w:r>
-      <w:proofErr w:type="spellEnd"/>
-      <w:r>
-        <w:t>) → The playlist is deleted.</w:t>
+        <w:t>If the user confirms (DeleteSuccess) → The playlist is deleted.</w:t>
       </w:r>
     </w:p>
     <w:p>

</xml_diff>